<commit_message>
Restructure Task 3 code placement and expand narrative counts
Co-authored-by: Harsh Kaushik <harsh-kaushikk@users.noreply.github.com>
</commit_message>
<xml_diff>
--- a/Programming_for_Data_Science_Tasks2_3_Kashifah_Shaikh_v2.docx
+++ b/Programming_for_Data_Science_Tasks2_3_Kashifah_Shaikh_v2.docx
@@ -48,17 +48,17 @@
         <w:pStyle w:val="Heading3"/>
       </w:pPr>
       <w:r>
-        <w:t>2.1 How I interpreted the task requirements</w:t>
+        <w:t>2.1 How I interpreted the game and its constraints</w:t>
       </w:r>
     </w:p>
     <w:p>
       <w:r>
-        <w:t>When I read this task, I treated it as a design-and-testing problem rather than just a coding problem. The game itself is simple to understand, but the implementation has dependency rules that can easily be broken if I write rushed logic. In the physical game, a lot of rolls are ignored, and my function has to behave the same way. So I focused on designing a reliable state update process first, and then deciding how I would test every rule clearly.</w:t>
+        <w:t>I treated this task as a logic-and-design problem. The game itself is easy to understand, but the implementation has dependency rules that create many invalid rolls. My program design must copy that real behaviour exactly: some rolls should do nothing when prerequisites are missing.</w:t>
       </w:r>
     </w:p>
     <w:p>
       <w:r>
-        <w:t>The required final beetle is fixed: one body, one head, two antennae, two eyes, one mouth, and six legs. The die mapping is fixed: 1 gives body, 2 gives head, 3 gives antenna, 4 gives eye, 5 gives mouth, and 6 gives leg. The key restrictions are what make the logic interesting: I cannot add any parts before body, and I cannot add antennae/eyes/mouth before head. If a roll is invalid under these restrictions, I should ignore it and continue.</w:t>
+        <w:t>The completion target is fixed: one body, one head, two antennae, two eyes, one mouth, and six legs. Dice mapping is also fixed (1 body, 2 head, 3 antenna, 4 eye, 5 mouth, 6 leg). Two constraints are central: no parts before body, and no antenna/eye/mouth before head. In software terms, each roll is an attempted update, not a guaranteed update.</w:t>
       </w:r>
     </w:p>
     <w:p>
@@ -66,17 +66,17 @@
         <w:pStyle w:val="Heading3"/>
       </w:pPr>
       <w:r>
-        <w:t>2.2 Design options I considered and my final recommendation</w:t>
+        <w:t>2.2 Options I considered and what I recommend</w:t>
       </w:r>
     </w:p>
     <w:p>
       <w:r>
-        <w:t>I compared three implementation ideas before deciding on one. My first option was to write one long while-loop with many if/elif blocks. This approach mirrors human play, but it gets messy quickly because the same conditions appear repeatedly. If I later change one rule, I could forget to change it in every place. My second option was to use a class, but for this assignment that felt heavier than needed because the game only tracks one player state and one completion condition.</w:t>
+        <w:t>I first considered one large while-loop with many nested if statements. It works for small prototypes, but repeated rule checks make it difficult to maintain and easy to break when rules change. I also considered a class-based structure, but for this assignment that felt unnecessary because one function can handle one-player state cleanly.</w:t>
       </w:r>
     </w:p>
     <w:p>
       <w:r>
-        <w:t>My recommended option is one main function that uses dictionaries plus a small validation helper. I would store current part counts in one dictionary and required targets in another dictionary. Then I would map each die value to its part name using a third dictionary. This gives me readable code and easier debugging. Most importantly, it keeps rules centralized, which means I can test them in a predictable way and explain them clearly in the report.</w:t>
+        <w:t>My recommended design is one main function with dictionaries and a rule-check helper. A state dictionary tracks collected parts, a target dictionary stores required counts, and a roll map connects die values to parts. The helper function validates whether a part can be collected before any state mutation happens. This separation makes the logic clearer and testing easier.</w:t>
       </w:r>
     </w:p>
     <w:p>
@@ -84,7 +84,7 @@
         <w:pStyle w:val="Heading3"/>
       </w:pPr>
       <w:r>
-        <w:t>2.3 Proposed function logic in plain steps</w:t>
+        <w:t>2.3 Incremental development plan</w:t>
       </w:r>
     </w:p>
     <w:p>
@@ -92,7 +92,7 @@
         <w:pStyle w:val="ListBullet"/>
       </w:pPr>
       <w:r>
-        <w:t>Create dictionaries for current state and required targets.</w:t>
+        <w:t>Step 1: implement roll mapping and basic loop control.</w:t>
       </w:r>
     </w:p>
     <w:p>
@@ -100,7 +100,7 @@
         <w:pStyle w:val="ListBullet"/>
       </w:pPr>
       <w:r>
-        <w:t>Roll the die and map roll value to a candidate part.</w:t>
+        <w:t>Step 2: implement state updates without restrictions to verify counters.</w:t>
       </w:r>
     </w:p>
     <w:p>
@@ -108,7 +108,7 @@
         <w:pStyle w:val="ListBullet"/>
       </w:pPr>
       <w:r>
-        <w:t>Check whether that part can be collected at the current state.</w:t>
+        <w:t>Step 3: add body-first dependency and test blocked rolls.</w:t>
       </w:r>
     </w:p>
     <w:p>
@@ -116,7 +116,7 @@
         <w:pStyle w:val="ListBullet"/>
       </w:pPr>
       <w:r>
-        <w:t>If valid, update count; if invalid, ignore roll and continue.</w:t>
+        <w:t>Step 4: add head dependency for antenna/eye/mouth and retest.</w:t>
       </w:r>
     </w:p>
     <w:p>
@@ -124,7 +124,7 @@
         <w:pStyle w:val="ListBullet"/>
       </w:pPr>
       <w:r>
-        <w:t>Repeat until all part counts match target counts exactly.</w:t>
+        <w:t>Step 5: add upper limits for each body part count.</w:t>
       </w:r>
     </w:p>
     <w:p>
@@ -132,12 +132,20 @@
         <w:pStyle w:val="ListBullet"/>
       </w:pPr>
       <w:r>
-        <w:t>Return a summary (roll count and final beetle state).</w:t>
+        <w:t>Step 6: add completion check and return summary output.</w:t>
+      </w:r>
+    </w:p>
+    <w:p>
+      <w:pPr>
+        <w:pStyle w:val="ListBullet"/>
+      </w:pPr>
+      <w:r>
+        <w:t>Step 7: refactor repeated checks into helper validation logic.</w:t>
       </w:r>
     </w:p>
     <w:p>
       <w:r>
-        <w:t>I like this structure because it separates decision-making from updates. I first ask 'is this move allowed?' and only then modify state. That makes the function safer and easier to explain to another student or marker.</w:t>
+        <w:t>I prefer this staged approach because each change introduces one new rule, so if a test fails I can trace the cause immediately.</w:t>
       </w:r>
     </w:p>
     <w:p>
@@ -145,17 +153,32 @@
         <w:pStyle w:val="Heading3"/>
       </w:pPr>
       <w:r>
-        <w:t>2.4 How I would use incremental development</w:t>
+        <w:t>2.4 How I would test this function properly</w:t>
       </w:r>
     </w:p>
     <w:p>
       <w:r>
-        <w:t>I would not write everything at once. I would build it in increments. In increment 1, I would only test rolling and mapping values. In increment 2, I would track part counts with no restrictions just to verify update mechanics. In increment 3, I would add the body-first restriction and test it with fixed roll sequences. In increment 4, I would add the head restriction for antenna/eye/mouth and verify that these parts are blocked until head exists.</w:t>
+        <w:t>I would also add scenario-based tests that mirror mistakes a real player might make. For example, I would test repeated attempts to collect mouth before head, repeated attempts to collect extra legs after six are already collected, and long stretches of non-productive rolls. These tests are useful because they check stability under frustrating but realistic game paths.</w:t>
       </w:r>
     </w:p>
     <w:p>
       <w:r>
-        <w:t>In increment 5, I would add limits so part counts cannot exceed targets. In increment 6, I would add completion checking and clean return output. In increment 7, I would refactor repeated logic into a helper rule check. This staged process helps me isolate bugs early. If a test fails, I know exactly which increment introduced the issue, so fixing it is faster.</w:t>
+        <w:t>Another useful test is a trace-validation test where I store every roll and decision (accepted or rejected) and then manually inspect a short run for rule consistency. This gives qualitative confidence that the function is not only producing a final completed state but also following valid transitions at every intermediate step.</w:t>
+      </w:r>
+    </w:p>
+    <w:p>
+      <w:r>
+        <w:t>If I had more time, I would add simple statistical checks on simulation output, such as verifying that completion always occurs and that roll-count distribution is plausible rather than extreme. While these checks are not proof of correctness alone, they are useful secondary evidence that my implementation behaves sensibly at scale.</w:t>
+      </w:r>
+    </w:p>
+    <w:p>
+      <w:r>
+        <w:t>I would start with deterministic roll sequences instead of random rolls, so expected behaviour can be asserted exactly. For example, [2,3,1] should only collect body at the third roll. Sequence [1,3,2,3] should reject first antenna and accept second antenna after head exists.</w:t>
+      </w:r>
+    </w:p>
+    <w:p>
+      <w:r>
+        <w:t>I would then check invariants after each update: no count goes above target, no negative counts appear, and face parts remain zero while head is zero. Finally, I would run many random simulations to verify every game terminates with a valid completed beetle.</w:t>
       </w:r>
     </w:p>
     <w:p>
@@ -163,22 +186,17 @@
         <w:pStyle w:val="Heading3"/>
       </w:pPr>
       <w:r>
-        <w:t>2.5 Specific testing strategy I would apply</w:t>
+        <w:t>2.5 Mutant variant: one body and two complete heads</w:t>
       </w:r>
     </w:p>
     <w:p>
       <w:r>
-        <w:t>I would begin with deterministic tests (fixed roll lists) so I can assert exact expected outcomes. For example, [2,3,1] should only collect body at the third roll. [1,3,2,3] should reject the first antenna and accept the second after head appears. [1,1,1] should still keep body at count 1 because extra bodies are invalid.</w:t>
+        <w:t>For the mutant variant, targets become body=1, head=2, antenna=4, eye=4, mouth=2, leg=6. The architecture does not need a full rewrite. I can keep the same loop and validator but update target values and dependency rules.</w:t>
       </w:r>
     </w:p>
     <w:p>
       <w:r>
-        <w:t>I would also run invariant checks after each update: no part can exceed target, no part count can become negative, and face parts (antenna/eye/mouth) must remain zero while head is zero. Another important check is that game completion becomes true only when all required counts are exactly met. These tests prove rule integrity, not just final outcome.</w:t>
-      </w:r>
-    </w:p>
-    <w:p>
-      <w:r>
-        <w:t>Finally, I would run many random simulations to check practical robustness. For example, I could run 1000 games and verify that every game terminates with a valid complete beetle. I would inspect average roll count and range to make sure results look realistic. This does not replace unit tests, but it adds confidence that the full logic works repeatedly.</w:t>
+        <w:t>The main change is dynamic dependence on head count: antenna &lt;= 2*heads, eye &lt;= 2*heads, mouth &lt;= heads. This keeps the design flexible and shows that the proposed structure adapts to changing requirements without becoming complicated.</w:t>
       </w:r>
     </w:p>
     <w:p>
@@ -186,35 +204,17 @@
         <w:pStyle w:val="Heading3"/>
       </w:pPr>
       <w:r>
-        <w:t>2.6 How my design changes for the mutant Beetle</w:t>
+        <w:t>2.6 Task 2 conclusion</w:t>
       </w:r>
     </w:p>
     <w:p>
       <w:r>
-        <w:t>For the mutant game, I still keep one body but require two complete heads. That changes target counts to body=1, head=2, antenna=4, eye=4, mouth=2, leg=6. I do not need a completely new architecture. I can reuse the same loop and rule-check approach by changing target values and some dependency formulas.</w:t>
+        <w:t>Overall, this task reinforced that good program design begins with modelling constraints clearly, not with writing long code first. By translating each game rule into a validation condition and testing each condition separately, I can keep implementation reliable and explainable. I also found that planning the mutant variant early helps produce cleaner base logic, because the core design becomes parameter-driven instead of hard-coded for one single ruleset.</w:t>
       </w:r>
     </w:p>
     <w:p>
       <w:r>
-        <w:t>The main rule difference is dynamic dependency on current head count. In the normal game, head is a simple yes/no gate. In the mutant game, face-part capacity depends on how many heads are already collected. So I would enforce constraints such as antenna &lt;= 2*heads, eye &lt;= 2*heads, and mouth &lt;= heads. This keeps behaviour logically correct while keeping code structure simple.</w:t>
-      </w:r>
-    </w:p>
-    <w:p>
-      <w:r>
-        <w:t>Because the design is parameterized by target dictionaries and validation rules, adapting the variant becomes a controlled extension rather than a rewrite. That is exactly what I want from a good software design: easy adaptation when requirements change.</w:t>
-      </w:r>
-    </w:p>
-    <w:p>
-      <w:pPr>
-        <w:pStyle w:val="Heading3"/>
-      </w:pPr>
-      <w:r>
-        <w:t>2.7 Task 2 conclusion</w:t>
-      </w:r>
-    </w:p>
-    <w:p>
-      <w:r>
-        <w:t>My final recommendation is a single-function, dictionary-based design with explicit rule validation and staged incremental development. This approach matches physical gameplay, keeps logic readable, and supports strong testing. It also adapts well to the mutant two-head variant by modifying targets and rule formulas without redesigning the whole program.</w:t>
+        <w:t>My final design recommendation is a one-function, dictionary-based structure with explicit validation before updates, implemented incrementally and tested with deterministic plus simulation checks. This gives correctness, readability, and easy adaptation for the mutant rule set.</w:t>
       </w:r>
     </w:p>
     <w:p>
@@ -235,22 +235,22 @@
         <w:pStyle w:val="Heading3"/>
       </w:pPr>
       <w:r>
-        <w:t>3.1 Part (a): Application area and detailed University Hospital Coventry case</w:t>
+        <w:t>3.1 Part (a): application area and specific Coventry case</w:t>
       </w:r>
     </w:p>
     <w:p>
       <w:r>
-        <w:t>For this task, I chose emergency triage text at University Hospital Coventry as my unstructured-data application area. I selected this case because triage notes are genuinely unstructured: they are free-text descriptions written quickly in clinical settings, often with abbreviations, incomplete grammar, and variable wording between staff members. This makes them a realistic and high-impact data science target.</w:t>
+        <w:t>I chose emergency triage notes at University Hospital Coventry as my unstructured-data case. These notes are free text, written quickly by clinicians, and often contain abbreviations and incomplete grammar. Because the input is natural language rather than structured columns, this is a genuine unstructured-data problem.</w:t>
       </w:r>
     </w:p>
     <w:p>
       <w:r>
-        <w:t>The specific task I defined is urgent-versus-routine classification of incoming triage notes. A note such as 'crushing chest pain radiating to left arm, sweating and nausea' should clearly be treated as higher urgency than a note like 'mild ankle sprain, able to bear weight.' If a model can provide a consistent risk suggestion, it can help prioritisation workflow during busy periods.</w:t>
+        <w:t>My specific task is urgent-versus-routine note classification to support prioritisation. For example, phrases like 'crushing chest pain', 'possible sepsis', and 'oxygen saturation dropping' should usually indicate higher urgency than phrases describing minor stable injuries.</w:t>
       </w:r>
     </w:p>
     <w:p>
       <w:r>
-        <w:t>I am not treating this as autonomous diagnosis. The goal is clinical decision support, where a system highlights likely urgency and clinicians still make final decisions. This distinction matters because healthcare systems require accountability and transparent review. In my view, model output should be advisory, auditable, and easy to override by staff.</w:t>
+        <w:t>This is decision support, not automated diagnosis. I treat model output as an advisory signal that can help triage ordering, while clinicians remain responsible for final judgement.</w:t>
       </w:r>
     </w:p>
     <w:p>
@@ -258,22 +258,27 @@
         <w:pStyle w:val="Heading3"/>
       </w:pPr>
       <w:r>
-        <w:t>3.2 Why this is an unstructured-data problem</w:t>
+        <w:t>3.2 Part (b): selected libraries and justification</w:t>
       </w:r>
     </w:p>
     <w:p>
       <w:r>
-        <w:t>This case is unstructured because the primary input is natural language text, not predefined numeric columns. Before any model can be trained, text must be transformed into representations that algorithms can use. That transformation step includes tokenisation, filtering, and vectorisation. Without this preprocessing, model quality and reliability are poor.</w:t>
+        <w:t>I considered alternatives such as spaCy and deep learning frameworks, but for this coursework I chose NLTK and scikit-learn because they fit the level of explanation required and are easier to justify step by step. They also support transparent workflows, which is important when discussing healthcare-related decisions where explanation quality matters as much as raw score.</w:t>
       </w:r>
     </w:p>
     <w:p>
       <w:r>
-        <w:t>Another challenge is context sensitivity. Clinical risk is often expressed by short phrases rather than single words. For example, 'chest pain' carries stronger signal than either term alone. This influenced my library choice, because I wanted a method that can capture phrase-level information and still be explainable at coursework level.</w:t>
+        <w:t>Another reason for this choice is teaching value. NLTK lets me show exactly how token-level preprocessing affects downstream behaviour, while scikit-learn lets me demonstrate a formal model pipeline with standard evaluation outputs. Together they allow me to explain both descriptive and predictive analysis without hiding key logic inside black-box abstractions.</w:t>
       </w:r>
     </w:p>
     <w:p>
       <w:r>
-        <w:t>There is also a data quality challenge. Different clinicians may describe the same condition in different ways, and spelling or abbreviation style can vary by shift, department, and experience level. Because of this, a practical NLP workflow has to be robust to variation and should be evaluated repeatedly, not just once.</w:t>
+        <w:t>I selected NLTK for exploratory text analysis and scikit-learn for supervised classification. NLTK helps me understand language patterns and token distributions, while scikit-learn gives a reproducible prediction pipeline with measurable performance metrics.</w:t>
+      </w:r>
+    </w:p>
+    <w:p>
+      <w:r>
+        <w:t>I applied both libraries independently to the same problem. This lets me compare descriptive analysis (NLTK) against predictive modelling (scikit-learn) and give a balanced recommendation.</w:t>
       </w:r>
     </w:p>
     <w:p>
@@ -281,162 +286,27 @@
         <w:pStyle w:val="Heading3"/>
       </w:pPr>
       <w:r>
-        <w:t>3.3 Part (b): Library selection with justification</w:t>
+        <w:t>3.3 Independent application using NLTK (code + output + explanation)</w:t>
       </w:r>
     </w:p>
     <w:p>
       <w:r>
-        <w:t>I selected two libraries: NLTK and scikit-learn. I chose NLTK for exploratory text processing because it helps me inspect token patterns and understand language differences across classes before modelling. I chose scikit-learn for supervised prediction because it gives robust, reproducible pipelines and standard evaluation metrics.</w:t>
+        <w:t>From my perspective, this NLTK stage serves as diagnostic preparation. Before I trust any classifier, I want to see whether urgent and routine notes are actually different in vocabulary. If both classes looked almost identical after preprocessing, I would know that model performance would likely be unstable and that I should reconsider feature design or labeling quality.</w:t>
       </w:r>
     </w:p>
     <w:p>
       <w:r>
-        <w:t>I deliberately applied the two libraries independently. The NLTK path answers: what language features appear in urgent versus routine notes? The scikit-learn path answers: can I train a model that predicts urgent versus routine from text features? Using both gave me a stronger workflow than using only one library.</w:t>
+        <w:t>I also use this stage to identify data-cleaning risks. For example, if stopword filtering removes words that are clinically important in context, I would need to adjust preprocessing. Likewise, if tokenization splits medical shorthand in unhelpful ways, I would need domain-aware normalization. So this stage is not just word counting; it is quality control for the later model stage.</w:t>
       </w:r>
     </w:p>
     <w:p>
       <w:r>
-        <w:t>I also chose these libraries because they are well documented and widely used in teaching contexts, which makes my pipeline easier to justify and easier for another student to reproduce. Reproducibility matters here because I need to show not only a result, but a method that can be repeated and critiqued.</w:t>
-      </w:r>
-    </w:p>
-    <w:p>
-      <w:pPr>
-        <w:pStyle w:val="Heading3"/>
-      </w:pPr>
-      <w:r>
-        <w:t>3.4 Independent application using NLTK</w:t>
+        <w:t>In this part, I tokenize notes, lowercase tokens, remove basic stopwords, and count token frequencies by class. The goal is to inspect whether urgent and routine notes differ linguistically before training a classifier.</w:t>
       </w:r>
     </w:p>
     <w:p>
       <w:r>
-        <w:t>In the NLTK path, I tokenized notes, lowercased tokens, removed basic stopwords, and counted frequent terms by class. This gives me a descriptive comparison between urgent and routine language. I then plotted token counts to visualize how class vocabulary differs.</w:t>
-      </w:r>
-    </w:p>
-    <w:p>
-      <w:r>
-        <w:t>The central concept here is exploratory text analysis, not final classification. By looking at token distributions first, I can check whether my labels align with clear language patterns. In my output, urgent notes contained stronger symptom words and acute terms more often than routine notes, which supports moving to supervised modelling.</w:t>
-      </w:r>
-    </w:p>
-    <w:p>
-      <w:r>
-        <w:t>The strength of this approach is interpretability. The limitation is that token counts can miss context and negation (for example, 'no chest pain' still includes the token 'chest'). So NLTK exploration is useful but should not be the only decision mechanism in a clinical setting.</w:t>
-      </w:r>
-    </w:p>
-    <w:p>
-      <w:r>
-        <w:t>From a practical perspective, this step helped me spot which terms were likely to influence classification and whether my synthetic examples were too similar or too easy. In future work, I would add simple negation handling and domain phrase dictionaries to reduce misleading token-level signals.</w:t>
-      </w:r>
-    </w:p>
-    <w:p>
-      <w:pPr>
-        <w:pStyle w:val="Heading3"/>
-      </w:pPr>
-      <w:r>
-        <w:t>3.5 Independent application using scikit-learn (TF-IDF + Logistic Regression)</w:t>
-      </w:r>
-    </w:p>
-    <w:p>
-      <w:r>
-        <w:t>In the scikit-learn path, I used a pipeline with TF-IDF vectorization and Logistic Regression. TF-IDF converts text into weighted numerical features, and Logistic Regression learns a linear decision boundary for urgent/routine classes. I also used bigrams so phrase-level signals such as 'chest pain' can be represented directly.</w:t>
-      </w:r>
-    </w:p>
-    <w:p>
-      <w:r>
-        <w:t>The central algorithmic idea is straightforward but effective: represent text as features, fit a model on labeled examples, and evaluate on held-out data. I included confusion matrix and class report in the output because those metrics show more detail than accuracy alone.</w:t>
-      </w:r>
-    </w:p>
-    <w:p>
-      <w:r>
-        <w:t>Because my demonstration dataset is intentionally small, I do not overclaim performance. The key value here is showing the setup and application process clearly: preprocessing, splitting, fitting, evaluating, and predicting a new note. This teaches the main workflow and algorithm logic in a transparent way.</w:t>
-      </w:r>
-    </w:p>
-    <w:p>
-      <w:r>
-        <w:t>If I had larger data, I would add cross-validation, class imbalance handling, and threshold analysis focused on urgent-case recall. In healthcare-related classification, a model with high overall accuracy can still be unsafe if it misses urgent samples too often, so class-specific performance is essential.</w:t>
-      </w:r>
-    </w:p>
-    <w:p>
-      <w:pPr>
-        <w:pStyle w:val="Heading3"/>
-      </w:pPr>
-      <w:r>
-        <w:t>3.6 Recommendation based on both libraries and additional sources</w:t>
-      </w:r>
-    </w:p>
-    <w:p>
-      <w:r>
-        <w:t>Based on my experience in this task, I would recommend a phased combined workflow. First, use NLTK-style analysis to inspect vocabulary, clean data strategy, and communication of basic patterns to stakeholders. Second, use scikit-learn TF-IDF + Logistic Regression as a transparent baseline classifier with measurable outputs.</w:t>
-      </w:r>
-    </w:p>
-    <w:p>
-      <w:r>
-        <w:t>For real clinical use at University Hospital Coventry, this should only proceed with anonymised data governance, fairness checks across subgroups, and clinician-in-the-loop oversight. The model should flag risk suggestions, not make autonomous triage decisions. False negatives should be monitored closely because missing urgent cases has higher clinical risk than over-triaging some routine cases.</w:t>
-      </w:r>
-    </w:p>
-    <w:p>
-      <w:r>
-        <w:t>Overall, NLTK and scikit-learn are both recommendable, but for different purposes. NLTK is stronger for exploration and interpretive checks; scikit-learn is stronger for deployable baseline prediction with reproducible evaluation. Using them together gives a more complete and practical pipeline.</w:t>
-      </w:r>
-    </w:p>
-    <w:p>
-      <w:r>
-        <w:t>I would also recommend maintaining a feedback loop where clinicians can flag model disagreements. These flagged cases can be reviewed and later used for retraining, which gradually improves model reliability in local context. Without this feedback loop, model performance may drift and become less trustworthy over time.</w:t>
-      </w:r>
-    </w:p>
-    <w:p>
-      <w:pPr>
-        <w:pStyle w:val="Heading3"/>
-      </w:pPr>
-      <w:r>
-        <w:t>3.7 Practical limitations and ethical considerations</w:t>
-      </w:r>
-    </w:p>
-    <w:p>
-      <w:r>
-        <w:t>A major limitation of my demonstration is dataset scale. I used a small synthetic set to show method, but real deployment would need much larger anonymised and clinically validated data. Small samples are good for coursework demonstration but not enough for clinical confidence.</w:t>
-      </w:r>
-    </w:p>
-    <w:p>
-      <w:r>
-        <w:t>Another limitation is language diversity. Real triage text can include abbreviations, misspellings, multilingual fragments, and shorthand that simple preprocessing may not handle well. A production-grade system would need stronger normalization and possibly domain-specific vocabularies.</w:t>
-      </w:r>
-    </w:p>
-    <w:p>
-      <w:r>
-        <w:t>Ethically, decision support systems in hospitals must avoid over-automation. I would keep humans in control at all times, with transparent logging of model suggestions and clinician overrides. This protects patient safety and allows accountability when outcomes are reviewed.</w:t>
-      </w:r>
-    </w:p>
-    <w:p>
-      <w:r>
-        <w:t>Finally, governance requirements are non-negotiable: GDPR compliance, restricted access controls, documented model versions, and periodic audit checks. A technically accurate model is still not acceptable if governance and fairness standards are missing.</w:t>
-      </w:r>
-    </w:p>
-    <w:p>
-      <w:pPr>
-        <w:pStyle w:val="Heading3"/>
-      </w:pPr>
-      <w:r>
-        <w:t>3.8 Task 3 conclusion</w:t>
-      </w:r>
-    </w:p>
-    <w:p>
-      <w:r>
-        <w:t>In this task, I defined a realistic unstructured-data problem in a hospital context, justified two appropriate Python libraries, applied both independently with code and outputs, and explained the central concepts behind each approach. My final recommendation is a combined workflow: exploratory NLP first, supervised baseline modelling second, and strict human/governance controls throughout.</w:t>
-      </w:r>
-    </w:p>
-    <w:p>
-      <w:r>
-        <w:t>Code Listing 1: NLTK + visualization section (extract)</w:t>
-      </w:r>
-    </w:p>
-    <w:p>
-      <w:r>
-        <w:t>This code block tokenizes the notes, removes common stopwords, splits tokens by class label, and then counts word frequencies with Counter. The chart command plots urgent and routine token counts side by side so I can compare language patterns visually.</w:t>
-      </w:r>
-    </w:p>
-    <w:p>
-      <w:r>
-        <w:t>In my run, urgent notes showed stronger symptom terms and more acute vocabulary than routine notes. This supports the idea that the two classes are linguistically distinguishable and gives a reason to proceed to supervised modeling.</w:t>
+        <w:t>Code Listing 1: NLTK preprocessing and token analysis</w:t>
       </w:r>
     </w:p>
     <w:p>
@@ -558,17 +428,26 @@
         <w:br/>
         <w:t xml:space="preserve">    plt.bar([i - 0.2 for i in x], u_vals, width=0.4, color='crimson', label='Urgent')</w:t>
         <w:br/>
-        <w:t xml:space="preserve">    plt.bar([i + 0.2 for i in x], r_vals, width=0.4, color='royalblue', label=</w:t>
+        <w:t xml:space="preserve">    plt.bar([i + 0.2 for i in x], r_vals, width=0.4, color='royalblue', label='Routine')</w:t>
+        <w:br/>
+        <w:t xml:space="preserve">    plt.xticks(list(x), labels, rotation=45, ha='right')</w:t>
+        <w:br/>
+        <w:t xml:space="preserve">    plt.ylabel('Token count')</w:t>
+        <w:br/>
+        <w:t xml:space="preserve">    plt.title('Token counts after NLTK preprocessing')</w:t>
+        <w:br/>
+        <w:t xml:space="preserve">    plt.legend()</w:t>
+        <w:br/>
+        <w:t xml:space="preserve">    plt.tight_layout()</w:t>
+        <w:br/>
+        <w:t xml:space="preserve">    plt.savefig(save_path, dpi=180)</w:t>
+        <w:br/>
+        <w:t xml:space="preserve">    plt.close()</w:t>
       </w:r>
     </w:p>
     <w:p>
       <w:r>
-        <w:t>Output Listing 1: NLTK-related output</w:t>
-      </w:r>
-    </w:p>
-    <w:p>
-      <w:r>
-        <w:t>I interpret this output as exploratory evidence rather than final prediction performance. It tells me which terms appear most often in each class and highlights where simple token-level analysis can help or mislead (for example, limited handling of negation).</w:t>
+        <w:t>Output Listing 1: token analysis output</w:t>
       </w:r>
     </w:p>
     <w:p>
@@ -592,19 +471,14 @@
     </w:p>
     <w:p>
       <w:r>
-        <w:t>Figure 1: Token frequency comparison after preprocessing</w:t>
-      </w:r>
-    </w:p>
-    <w:p>
-      <w:r>
-        <w:t>In the graph, urgent terms are concentrated around high-risk symptom language, while routine terms are more associated with minor injury descriptions. The figure supports the text explanation and helps communicate results quickly to a non-technical reader.</w:t>
+        <w:t>Figure 1: token frequency comparison after preprocessing</w:t>
       </w:r>
     </w:p>
     <w:p>
       <w:r>
         <w:drawing>
           <wp:inline xmlns:a="http://schemas.openxmlformats.org/drawingml/2006/main" xmlns:pic="http://schemas.openxmlformats.org/drawingml/2006/picture">
-            <wp:extent cx="5760720" cy="2400300"/>
+            <wp:extent cx="5669280" cy="2362200"/>
             <wp:docPr id="1" name="Picture 1"/>
             <wp:cNvGraphicFramePr>
               <a:graphicFrameLocks noChangeAspect="1"/>
@@ -625,7 +499,7 @@
                   <pic:spPr>
                     <a:xfrm>
                       <a:off x="0" y="0"/>
-                      <a:ext cx="5760720" cy="2400300"/>
+                      <a:ext cx="5669280" cy="2362200"/>
                     </a:xfrm>
                     <a:prstGeom prst="rect"/>
                   </pic:spPr>
@@ -638,17 +512,45 @@
     </w:p>
     <w:p>
       <w:r>
-        <w:t>Code Listing 2: scikit-learn classification section (extract)</w:t>
+        <w:t>Explanation of Code Listing 1 and Figure 1: the code builds class-wise token counters and then plots urgent vs routine token frequencies. In my result, urgent notes show stronger symptom vocabulary, while routine notes contain milder injury language. This indicates useful class separation in the sample text.</w:t>
       </w:r>
     </w:p>
     <w:p>
       <w:r>
-        <w:t>This code builds a pipeline with TF-IDF and Logistic Regression. TF-IDF converts notes into weighted numeric vectors, and Logistic Regression learns a boundary between urgent and routine labels. I include bigrams so short phrases such as chest pain are captured as features.</w:t>
+        <w:t>Interpretation: this stage is exploratory and highly interpretable, but token counting alone does not model full context or negation. So I use it as evidence-building before supervised modelling, not as the final decision method.</w:t>
+      </w:r>
+    </w:p>
+    <w:p>
+      <w:pPr>
+        <w:pStyle w:val="Heading3"/>
+      </w:pPr>
+      <w:r>
+        <w:t>3.4 Independent application using scikit-learn (code + output + explanation)</w:t>
       </w:r>
     </w:p>
     <w:p>
       <w:r>
-        <w:t>The train/test split and metrics output show the complete workflow from raw text to prediction. Even with a small demonstration dataset, this section demonstrates setup, training, evaluation, and inference in one reproducible pipeline.</w:t>
+        <w:t>The scikit-learn stage adds formal predictive testing. I can now evaluate how well text features map to urgency labels and inspect confusion patterns directly. Even when overall accuracy appears reasonable, confusion matrix details can reveal clinically risky behaviour, especially if urgent samples are misclassified as routine.</w:t>
+      </w:r>
+    </w:p>
+    <w:p>
+      <w:r>
+        <w:t>In healthcare-style triage support, class-level recall for urgent notes is usually more important than generic accuracy. If urgent recall is weak, the model may be unsafe despite acceptable headline metrics. For that reason, I would monitor urgent recall and false-negative count closely during model iteration.</w:t>
+      </w:r>
+    </w:p>
+    <w:p>
+      <w:r>
+        <w:t>I would also test sensitivity to train/test splits and random seeds. Small datasets can produce unstable metrics, so repeated evaluation is important before drawing conclusions. In a larger study, I would use cross-validation and confidence intervals to present more robust evidence of model behaviour.</w:t>
+      </w:r>
+    </w:p>
+    <w:p>
+      <w:r>
+        <w:t>In this part, I use TF-IDF and Logistic Regression. TF-IDF transforms notes into weighted numeric features, and Logistic Regression predicts urgent vs routine class labels. I include bigrams so short clinical phrases such as 'chest pain' can be represented directly.</w:t>
+      </w:r>
+    </w:p>
+    <w:p>
+      <w:r>
+        <w:t>Code Listing 2: scikit-learn TF-IDF + Logistic Regression pipeline</w:t>
       </w:r>
     </w:p>
     <w:p>
@@ -705,17 +607,11 @@
         <w:t xml:space="preserve">    run_nltk_analysis('task3_token_chart.png')</w:t>
         <w:br/>
         <w:t xml:space="preserve">    run_sklearn_classifier()</w:t>
-        <w:br/>
       </w:r>
     </w:p>
     <w:p>
       <w:r>
-        <w:t>Output Listing 2: classification metrics and new-note prediction</w:t>
-      </w:r>
-    </w:p>
-    <w:p>
-      <w:r>
-        <w:t>I use these metrics to judge not only overall accuracy but also class-level behaviour. For this kind of task, urgent-case errors matter most, so confusion-matrix interpretation is important. The new-note prediction confirms the pipeline is functioning end-to-end.</w:t>
+        <w:t>Output Listing 2: model metrics and new-note prediction</w:t>
       </w:r>
     </w:p>
     <w:p>
@@ -742,7 +638,72 @@
         <w:br/>
         <w:br/>
         <w:t>New note prediction: urgent</w:t>
-        <w:br/>
+      </w:r>
+    </w:p>
+    <w:p>
+      <w:r>
+        <w:t>Explanation of Code Listing 2 and Output Listing 2: the pipeline splits data, fits the model, prints confusion matrix and classification report, and then predicts an unseen sample. This demonstrates the complete workflow from raw text to model inference.</w:t>
+      </w:r>
+    </w:p>
+    <w:p>
+      <w:r>
+        <w:t>Interpretation: because my demonstration dataset is small, I do not overstate metrics. The value here is showing method clearly and explaining how the algorithm works. For larger real datasets, I would add cross-validation and threshold tuning, especially to reduce urgent-case misses.</w:t>
+      </w:r>
+    </w:p>
+    <w:p>
+      <w:pPr>
+        <w:pStyle w:val="Heading3"/>
+      </w:pPr>
+      <w:r>
+        <w:t>3.5 Recommendation and critical reflection</w:t>
+      </w:r>
+    </w:p>
+    <w:p>
+      <w:r>
+        <w:t>If this project moved beyond coursework, I would set up a staged evaluation plan with clinicians. Stage one would validate data labeling definitions, stage two would compare baseline models on larger anonymised samples, and stage three would run a silent pilot where model suggestions are logged but not actioned automatically. This would allow safety auditing before operational use.</w:t>
+      </w:r>
+    </w:p>
+    <w:p>
+      <w:r>
+        <w:t>I would also include bias and subgroup checks, because triage language can vary across age groups, communication styles, and comorbidity patterns. A model that performs well on aggregate but poorly on specific subgroups would not be acceptable in practice. Governance therefore includes not only privacy controls but also fairness analysis and transparent reporting.</w:t>
+      </w:r>
+    </w:p>
+    <w:p>
+      <w:r>
+        <w:t>Finally, I would design feedback loops where clinicians can mark model disagreements. Those reviewed disagreements become high-value training cases in future updates. In my opinion, this continuous feedback is one of the most important features of safe decision-support systems, because clinical language evolves and static models degrade over time.</w:t>
+      </w:r>
+    </w:p>
+    <w:p>
+      <w:r>
+        <w:t>Based on both independent applications, I recommend a combined workflow. First, use NLTK-style exploration to check language patterns and quality issues. Second, use scikit-learn as a transparent supervised baseline with measurable outputs.</w:t>
+      </w:r>
+    </w:p>
+    <w:p>
+      <w:r>
+        <w:t>For real clinical use, governance is essential: anonymised data handling, fairness checks, clinician-in-the-loop review, and continuous monitoring for drift. The model should provide advisory flags only, with clear override by staff.</w:t>
+      </w:r>
+    </w:p>
+    <w:p>
+      <w:r>
+        <w:t>So my final recommendation is not choosing one library over the other. I would use both in sequence because they solve different parts of the applied problem.</w:t>
+      </w:r>
+    </w:p>
+    <w:p>
+      <w:pPr>
+        <w:pStyle w:val="Heading3"/>
+      </w:pPr>
+      <w:r>
+        <w:t>3.6 Task 3 conclusion</w:t>
+      </w:r>
+    </w:p>
+    <w:p>
+      <w:r>
+        <w:t>This task also highlighted the importance of combining technical performance with interpretability and governance. A model can be mathematically correct yet still unsuitable if stakeholders cannot understand its behaviour or if safety processes are missing. For this reason, my final recommendation emphasises method transparency, human oversight, and continuous validation rather than one-off model scores.</w:t>
+      </w:r>
+    </w:p>
+    <w:p>
+      <w:r>
+        <w:t>I defined a realistic unstructured clinical text problem, applied two libraries independently with code and outputs in their respective sections, explained each central concept, and evaluated practical use limits. A staged approach using exploratory NLP plus supervised baseline modelling gives the strongest and most responsible solution pathway for this scenario.</w:t>
       </w:r>
     </w:p>
     <w:p>
@@ -832,6 +793,14 @@
         <w:t>Student contribution: final interpretation, edits, and submission decisions completed by student.</w:t>
       </w:r>
     </w:p>
+    <w:p/>
+    <w:p/>
+    <w:p/>
+    <w:p/>
+    <w:p/>
+    <w:p/>
+    <w:p/>
+    <w:p/>
     <w:p/>
     <w:p/>
     <w:p/>

</xml_diff>

<commit_message>
Update v2 report with expanded APA references
Co-authored-by: Harsh Kaushik <harsh-kaushikk@users.noreply.github.com>
</commit_message>
<xml_diff>
--- a/Programming_for_Data_Science_Tasks2_3_Kashifah_Shaikh_v2.docx
+++ b/Programming_for_Data_Science_Tasks2_3_Kashifah_Shaikh_v2.docx
@@ -719,7 +719,7 @@
         <w:pStyle w:val="ListBullet"/>
       </w:pPr>
       <w:r>
-        <w:t>Bird, S., Klein, E., &amp; Loper, E. (2009). Natural Language Processing with Python. O'Reilly Media.</w:t>
+        <w:t>Beck, K. (2003). Test-driven development: By example. Addison-Wesley.</w:t>
       </w:r>
     </w:p>
     <w:p>
@@ -727,7 +727,7 @@
         <w:pStyle w:val="ListBullet"/>
       </w:pPr>
       <w:r>
-        <w:t>Pedregosa, F., Varoquaux, G., Gramfort, A., Michel, V., Thirion, B., Grisel, O., Blondel, M., Prettenhofer, P., Weiss, R., Dubourg, V., VanderPlas, J., Passos, A., Cournapeau, D., Brucher, M., Perrot, M., &amp; Duchesnay, E. (2011). Scikit-learn: Machine learning in Python. Journal of Machine Learning Research, 12, 2825-2830.</w:t>
+        <w:t>Bird, S., Klein, E., &amp; Loper, E. (2009). Natural language processing with Python. O’Reilly Media.</w:t>
       </w:r>
     </w:p>
     <w:p>
@@ -735,7 +735,71 @@
         <w:pStyle w:val="ListBullet"/>
       </w:pPr>
       <w:r>
-        <w:t>Python Software Foundation. (2024). The Python Tutorial - Defining Functions. https://docs.python.org/3/tutorial/controlflow.html#defining-functions</w:t>
+        <w:t>European Parliament, &amp; Council of the European Union. (2016). Regulation (EU) 2016/679 (General Data Protection Regulation). https://eur-lex.europa.eu/eli/reg/2016/679/oj</w:t>
+      </w:r>
+    </w:p>
+    <w:p>
+      <w:pPr>
+        <w:pStyle w:val="ListBullet"/>
+      </w:pPr>
+      <w:r>
+        <w:t>Jurafsky, D., &amp; Martin, J. H. (2023). Speech and language processing (3rd ed. draft). https://web.stanford.edu/~jurafsky/slp3/</w:t>
+      </w:r>
+    </w:p>
+    <w:p>
+      <w:pPr>
+        <w:pStyle w:val="ListBullet"/>
+      </w:pPr>
+      <w:r>
+        <w:t>Manning, C. D., Raghavan, P., &amp; Schütze, H. (2008). Introduction to information retrieval. Cambridge University Press.</w:t>
+      </w:r>
+    </w:p>
+    <w:p>
+      <w:pPr>
+        <w:pStyle w:val="ListBullet"/>
+      </w:pPr>
+      <w:r>
+        <w:t>Myers, G. J., Sandler, C., &amp; Badgett, T. (2011). The art of software testing (3rd ed.). Wiley.</w:t>
+      </w:r>
+    </w:p>
+    <w:p>
+      <w:pPr>
+        <w:pStyle w:val="ListBullet"/>
+      </w:pPr>
+      <w:r>
+        <w:t>National Institute for Health and Care Excellence. (2022). Evidence standards framework (ESF) for digital health technologies. https://www.nice.org.uk/corporate/ecd7</w:t>
+      </w:r>
+    </w:p>
+    <w:p>
+      <w:pPr>
+        <w:pStyle w:val="ListBullet"/>
+      </w:pPr>
+      <w:r>
+        <w:t>NLTK Project. (n.d.). Natural Language Toolkit. https://www.nltk.org/</w:t>
+      </w:r>
+    </w:p>
+    <w:p>
+      <w:pPr>
+        <w:pStyle w:val="ListBullet"/>
+      </w:pPr>
+      <w:r>
+        <w:t>Pedregosa, F., Varoquaux, G., Gramfort, A., Michel, V., Thirion, B., Grisel, O., Blondel, M., Prettenhofer, P., Weiss, R., Dubourg, V., VanderPlas, J., Passos, A., Cournapeau, D., Brucher, M., Perrot, M., &amp; Duchesnay, E. (2011). Scikit-learn: Machine learning in Python. Journal of Machine Learning Research, 12, 2825–2830.</w:t>
+      </w:r>
+    </w:p>
+    <w:p>
+      <w:pPr>
+        <w:pStyle w:val="ListBullet"/>
+      </w:pPr>
+      <w:r>
+        <w:t>Python Software Foundation. (2024). The Python tutorial (Defining functions). https://docs.python.org/3/tutorial/controlflow.html#defining-functions</w:t>
+      </w:r>
+    </w:p>
+    <w:p>
+      <w:pPr>
+        <w:pStyle w:val="ListBullet"/>
+      </w:pPr>
+      <w:r>
+        <w:t>Robertson, S. (2004). Understanding inverse document frequency: On theoretical arguments for IDF. Journal of Documentation, 60(5), 503–520. https://doi.org/10.1108/00220410410560582</w:t>
       </w:r>
     </w:p>
     <w:p>
@@ -744,6 +808,14 @@
       </w:pPr>
       <w:r>
         <w:t>scikit-learn developers. (2024). Working with text data. https://scikit-learn.org/stable/tutorial/text_analytics/working_with_text_data.html</w:t>
+      </w:r>
+    </w:p>
+    <w:p>
+      <w:pPr>
+        <w:pStyle w:val="ListBullet"/>
+      </w:pPr>
+      <w:r>
+        <w:t>Sommerville, I. (2015). Software engineering (10th ed.). Pearson.</w:t>
       </w:r>
     </w:p>
     <w:p>
@@ -767,7 +839,7 @@
         <w:pStyle w:val="ListBullet"/>
       </w:pPr>
       <w:r>
-        <w:t>NLTK Project. (n.d.). Natural Language Toolkit. https://www.nltk.org/</w:t>
+        <w:t>World Health Organization. (2021). Ethics and governance of artificial intelligence for health. https://www.who.int/publications/i/item/9789240029200</w:t>
       </w:r>
     </w:p>
     <w:p>
@@ -793,6 +865,22 @@
         <w:t>Student contribution: final interpretation, edits, and submission decisions completed by student.</w:t>
       </w:r>
     </w:p>
+    <w:p/>
+    <w:p/>
+    <w:p/>
+    <w:p/>
+    <w:p/>
+    <w:p/>
+    <w:p/>
+    <w:p/>
+    <w:p/>
+    <w:p/>
+    <w:p/>
+    <w:p/>
+    <w:p/>
+    <w:p/>
+    <w:p/>
+    <w:p/>
     <w:p/>
     <w:p/>
     <w:p/>

</xml_diff>